<commit_message>
updates -- consolidating into one doc "..draft_3"
updates
</commit_message>
<xml_diff>
--- a/rem_front_matter.docx
+++ b/rem_front_matter.docx
@@ -246,53 +246,13 @@
         <w:rPr>
           <w:rFonts w:ascii="Times New Roman" w:hAnsi="Times New Roman" w:cs="Times New Roman"/>
         </w:rPr>
-        <w:t xml:space="preserve">hen – and under what structural and </w:t>
-      </w:r>
-      <w:proofErr w:type="gramStart"/>
-      <w:r>
-        <w:rPr>
-          <w:rFonts w:ascii="Times New Roman" w:hAnsi="Times New Roman" w:cs="Times New Roman"/>
-        </w:rPr>
-        <w:t>identity based</w:t>
-      </w:r>
-      <w:proofErr w:type="gramEnd"/>
-      <w:r>
-        <w:rPr>
-          <w:rFonts w:ascii="Times New Roman" w:hAnsi="Times New Roman" w:cs="Times New Roman"/>
-        </w:rPr>
-        <w:t xml:space="preserve"> conditions – are incarcerated people </w:t>
-      </w:r>
-      <w:proofErr w:type="gramStart"/>
-      <w:r>
-        <w:rPr>
-          <w:rFonts w:ascii="Times New Roman" w:hAnsi="Times New Roman" w:cs="Times New Roman"/>
-        </w:rPr>
-        <w:t>symbolically represented</w:t>
-      </w:r>
-      <w:proofErr w:type="gramEnd"/>
-      <w:r>
-        <w:rPr>
-          <w:rFonts w:ascii="Times New Roman" w:hAnsi="Times New Roman" w:cs="Times New Roman"/>
-        </w:rPr>
-        <w:t xml:space="preserve"> and epistemically included?</w:t>
-      </w:r>
-      <w:r>
-        <w:rPr>
-          <w:rFonts w:ascii="Times New Roman" w:hAnsi="Times New Roman" w:cs="Times New Roman"/>
-        </w:rPr>
-        <w:t xml:space="preserve"> [unless “When and under what conditions do legislators and the public treat incarcerated people as part of the political community</w:t>
-      </w:r>
-      <w:r>
-        <w:rPr>
-          <w:rFonts w:ascii="Times New Roman" w:hAnsi="Times New Roman" w:cs="Times New Roman"/>
-        </w:rPr>
-        <w:t>?” is better]</w:t>
-      </w:r>
-      <w:r>
-        <w:rPr>
-          <w:rFonts w:ascii="Times New Roman" w:hAnsi="Times New Roman" w:cs="Times New Roman"/>
-        </w:rPr>
-        <w:t xml:space="preserve"> Specifically, when do legislators symbolically recognize carceral citizens as constituents, treat them as epistemic contributors, or responded to as members of the political community – rather than purely policy objects? </w:t>
+        <w:t xml:space="preserve">hen – and under what structural and identity based conditions – are incarcerated people symbolically </w:t>
+      </w:r>
+      <w:r>
+        <w:rPr>
+          <w:rFonts w:ascii="Times New Roman" w:hAnsi="Times New Roman" w:cs="Times New Roman"/>
+        </w:rPr>
+        <w:t>recognized as constituents, treated as epistemic contributors, or responded to as members of the political community?</w:t>
       </w:r>
     </w:p>
     <w:p>
@@ -414,14 +374,7 @@
         <w:rPr>
           <w:rFonts w:ascii="Times New Roman" w:hAnsi="Times New Roman" w:cs="Times New Roman"/>
         </w:rPr>
-        <w:t xml:space="preserve">this project both considers [an extra dimension of epistemic </w:t>
-      </w:r>
-      <w:r>
-        <w:rPr>
-          <w:rFonts w:ascii="Times New Roman" w:hAnsi="Times New Roman" w:cs="Times New Roman"/>
-        </w:rPr>
-        <w:lastRenderedPageBreak/>
-        <w:t>inclusion = legislator behavior like prison visits)</w:t>
+        <w:t>this project both considers [an extra dimension of epistemic inclusion = legislator behavior like prison visits)</w:t>
       </w:r>
       <w:r>
         <w:rPr>
@@ -461,7 +414,14 @@
         <w:rPr>
           <w:rFonts w:ascii="Times New Roman" w:hAnsi="Times New Roman" w:cs="Times New Roman"/>
         </w:rPr>
-        <w:t xml:space="preserve">While I present these aims collectively in this proposal to indicate how a fellowship year will allow me to deepen the scope of my project/how particular questions will develop, this proposal’s methodology is primarily focused on measures of symbolic inclusion. Moreover, these questions constitute critical developmental components of my interest in – most broadly – how [systemic factures in the CJ system + systemic factors in systems of representation join to shape which groups are recognized as worthy of representation, and how such recognition is in a feedback loop with policy outcomes]. </w:t>
+        <w:t xml:space="preserve">While I present these aims collectively in this proposal to indicate how a fellowship year will allow me to deepen the scope of my project/how particular questions will develop, this </w:t>
+      </w:r>
+      <w:r>
+        <w:rPr>
+          <w:rFonts w:ascii="Times New Roman" w:hAnsi="Times New Roman" w:cs="Times New Roman"/>
+        </w:rPr>
+        <w:lastRenderedPageBreak/>
+        <w:t xml:space="preserve">proposal’s methodology is primarily focused on measures of symbolic inclusion. Moreover, these questions constitute critical developmental components of my interest in – most broadly – how [systemic factures in the CJ system + systemic factors in systems of representation join to shape which groups are recognized as worthy of representation, and how such recognition is in a feedback loop with policy outcomes]. </w:t>
       </w:r>
     </w:p>
     <w:p>
@@ -566,28 +526,34 @@
         <w:rPr>
           <w:rFonts w:ascii="Times New Roman" w:hAnsi="Times New Roman" w:cs="Times New Roman"/>
         </w:rPr>
+        <w:t xml:space="preserve">Symbolic representation responds to group size and electoral </w:t>
+      </w:r>
+      <w:r>
+        <w:rPr>
+          <w:rFonts w:ascii="Times New Roman" w:hAnsi="Times New Roman" w:cs="Times New Roman"/>
+        </w:rPr>
+        <w:t xml:space="preserve">incentives in a legislators’ district (Vishwanath). However, carceral citizens are numerically large yet politically </w:t>
+      </w:r>
+      <w:proofErr w:type="spellStart"/>
+      <w:r>
+        <w:rPr>
+          <w:rFonts w:ascii="Times New Roman" w:hAnsi="Times New Roman" w:cs="Times New Roman"/>
+        </w:rPr>
+        <w:t>invisibilized</w:t>
+      </w:r>
+      <w:proofErr w:type="spellEnd"/>
+      <w:r>
+        <w:rPr>
+          <w:rFonts w:ascii="Times New Roman" w:hAnsi="Times New Roman" w:cs="Times New Roman"/>
+        </w:rPr>
+        <w:t xml:space="preserve"> as they are legally excluded from the demos (Pottle), numerically erased (Nellis), and [something about dislocated]. Moreover, we know that legislators are embedded in epistemic circuits </w:t>
+      </w:r>
+      <w:r>
+        <w:rPr>
+          <w:rFonts w:ascii="Times New Roman" w:hAnsi="Times New Roman" w:cs="Times New Roman"/>
+        </w:rPr>
         <w:lastRenderedPageBreak/>
-        <w:t xml:space="preserve">Symbolic representation responds to group size and electoral </w:t>
-      </w:r>
-      <w:r>
-        <w:rPr>
-          <w:rFonts w:ascii="Times New Roman" w:hAnsi="Times New Roman" w:cs="Times New Roman"/>
-        </w:rPr>
-        <w:t xml:space="preserve">incentives in a legislators’ district (Vishwanath). However, carceral citizens are numerically large yet politically </w:t>
-      </w:r>
-      <w:proofErr w:type="spellStart"/>
-      <w:r>
-        <w:rPr>
-          <w:rFonts w:ascii="Times New Roman" w:hAnsi="Times New Roman" w:cs="Times New Roman"/>
-        </w:rPr>
-        <w:t>invisibilized</w:t>
-      </w:r>
-      <w:proofErr w:type="spellEnd"/>
-      <w:r>
-        <w:rPr>
-          <w:rFonts w:ascii="Times New Roman" w:hAnsi="Times New Roman" w:cs="Times New Roman"/>
-        </w:rPr>
-        <w:t xml:space="preserve"> as they are legally excluded from the demos (Pottle), numerically erased (Nellis), and [something about dislocated]. Moreover, we know that legislators are embedded in epistemic circuits structured around high-value voters (Mayhew, and statistical discrimination citation</w:t>
+        <w:t>structured around high-value voters (Mayhew, and statistical discrimination citation</w:t>
       </w:r>
       <w:r>
         <w:rPr>
@@ -835,14 +801,7 @@
         <w:rPr>
           <w:rFonts w:ascii="Times New Roman" w:hAnsi="Times New Roman" w:cs="Times New Roman"/>
         </w:rPr>
-        <w:t xml:space="preserve">State House. To my knowledge, beyond a Duke Law </w:t>
-      </w:r>
-      <w:r>
-        <w:rPr>
-          <w:rFonts w:ascii="Times New Roman" w:hAnsi="Times New Roman" w:cs="Times New Roman"/>
-        </w:rPr>
-        <w:lastRenderedPageBreak/>
-        <w:t xml:space="preserve">School student’s survey of </w:t>
+        <w:t xml:space="preserve">State House. To my knowledge, beyond a Duke Law School student’s survey of </w:t>
       </w:r>
       <w:proofErr w:type="gramStart"/>
       <w:r>
@@ -870,7 +829,14 @@
         <w:rPr>
           <w:rFonts w:ascii="Times New Roman" w:hAnsi="Times New Roman" w:cs="Times New Roman"/>
         </w:rPr>
-        <w:t xml:space="preserve"> unknown: the degree that symbolic recognition is not uniform, we do not know whether it varies by district carceral burden and across various policy dimensions: voting rights, apportionment, and political and policy environment (Grumbach). While we know that descriptive representation matters – [</w:t>
+        <w:t xml:space="preserve"> unknown: the degree that symbolic recognition is not uniform, we do not know whether it varies by district carceral burden and across various policy </w:t>
+      </w:r>
+      <w:r>
+        <w:rPr>
+          <w:rFonts w:ascii="Times New Roman" w:hAnsi="Times New Roman" w:cs="Times New Roman"/>
+        </w:rPr>
+        <w:lastRenderedPageBreak/>
+        <w:t>dimensions: voting rights, apportionment, and political and policy environment (Grumbach). While we know that descriptive representation matters – [</w:t>
       </w:r>
       <w:proofErr w:type="spellStart"/>
       <w:r>
@@ -951,14 +917,7 @@
         <w:rPr>
           <w:rFonts w:ascii="Times New Roman" w:hAnsi="Times New Roman" w:cs="Times New Roman"/>
         </w:rPr>
-        <w:t xml:space="preserve">or are not symbolically, epistemically, and relationally represented in legislative communication. I am applying for the fellowship/grant so that this project may take a small first step towards filling that gap, by developing a tiered </w:t>
-      </w:r>
-      <w:r>
-        <w:rPr>
-          <w:rFonts w:ascii="Times New Roman" w:hAnsi="Times New Roman" w:cs="Times New Roman"/>
-        </w:rPr>
-        <w:lastRenderedPageBreak/>
-        <w:t xml:space="preserve">measure of representation for carceral constituencies. Gant/fellowship will enable me to then [test a specific </w:t>
+        <w:t xml:space="preserve">or are not symbolically, epistemically, and relationally represented in legislative communication. I am applying for the fellowship/grant so that this project may take a small first step towards filling that gap, by developing a tiered measure of representation for carceral constituencies. Gant/fellowship will enable me to then [test a specific </w:t>
       </w:r>
       <w:proofErr w:type="gramStart"/>
       <w:r>
@@ -1725,7 +1684,6 @@
   <w:style w:type="character" w:default="1" w:styleId="DefaultParagraphFont">
     <w:name w:val="Default Paragraph Font"/>
     <w:uiPriority w:val="1"/>
-    <w:semiHidden/>
     <w:unhideWhenUsed/>
   </w:style>
   <w:style w:type="table" w:default="1" w:styleId="TableNormal">

</xml_diff>